<commit_message>
Dokumentacija: preformuliraj napomenu o opsegu izrade (IaC fokus + Terraform validacija)
</commit_message>
<xml_diff>
--- a/dokumentacija/IRUO_Projekt_Juraj_Herceg.docx
+++ b/dokumentacija/IRUO_Projekt_Juraj_Herceg.docx
@@ -400,7 +400,7 @@
           <w:color w:val="000000"/>
           <w:sz w:val="22"/>
         </w:rPr>
-        <w:t xml:space="preserve">Napomena o opsegu izrade: u sklopu kolegija nisu dodijeljeni resursi za izvođenje (nema pristupa Red Hat Academy okolini niti mogućnosti lokalnog pokretanja OpenStacka), stoga se, sukladno dogovoru s mentorom, infrastruktura ne deploya. Terraform konfiguracije i skripte napisane su tako da ispravno izvršavaju sve tražene funkcije, a njihova se valjanost provjerava naredbama </w:t>
+        <w:t xml:space="preserve">Napomena o opsegu izrade: težište ovog rada je na dizajnu arhitekture i implementaciji infrastrukture kao koda (IaC). Terraform konfiguracije i skripte napisane su tako da ispravno izvršavaju sve tražene funkcije, a njihova se ispravnost i potpunost provjeravaju ugrađenim Terraform alatima za statičku provjeru i izradu plana izvođenja (engl. execution plan) naredbama </w:t>
       </w:r>
     </w:p>
     <w:p>
@@ -466,7 +466,7 @@
           <w:color w:val="000000"/>
           <w:sz w:val="22"/>
         </w:rPr>
-        <w:t>bez stvarnog stvaranja resursa. Sav je kod organiziran u git repozitorij, a struktura projekta opisana je u poglavlju 3.</w:t>
+        <w:t>čime se potvrđuje valjanost konfiguracije bez stvarnog stvaranja resursa u oblaku. Sav je kod organiziran u git repozitorij, a struktura projekta opisana je u poglavlju 3.</w:t>
       </w:r>
     </w:p>
     <w:p>

</xml_diff>

<commit_message>
Projektna dokumentacija u Word formatu
</commit_message>
<xml_diff>
--- a/dokumentacija/IRUO_Projekt_Juraj_Herceg.docx
+++ b/dokumentacija/IRUO_Projekt_Juraj_Herceg.docx
@@ -102,7 +102,7 @@
     </w:p>
     <w:p>
       <w:pPr>
-        <w:spacing w:after="40"/>
+        <w:spacing w:after="800"/>
         <w:jc w:val="center"/>
       </w:pPr>
       <w:r>
@@ -114,22 +114,6 @@
           <w:sz w:val="24"/>
         </w:rPr>
         <w:t>Kolegij: Implementacija računarstva u oblaku</w:t>
-      </w:r>
-    </w:p>
-    <w:p>
-      <w:pPr>
-        <w:spacing w:after="800"/>
-        <w:jc w:val="center"/>
-      </w:pPr>
-      <w:r>
-        <w:rPr>
-          <w:rFonts w:ascii="Times New Roman" w:hAnsi="Times New Roman" w:eastAsia="Times New Roman"/>
-          <w:b w:val="0"/>
-          <w:i w:val="0"/>
-          <w:color w:val="000000"/>
-          <w:sz w:val="24"/>
-        </w:rPr>
-        <w:t>Mentor: Josip Stanešić</w:t>
       </w:r>
     </w:p>
     <w:p>

</xml_diff>

<commit_message>
Dokumentacija: zabiljezi stvarni OpenStack deployment na Red Hat Academy CL110 (49 resursa, sve instance ACTIVE) + lab prilagodbe
Co-Authored-By: Claude Opus 4.8 <noreply@anthropic.com>
</commit_message>
<xml_diff>
--- a/dokumentacija/IRUO_Projekt_Juraj_Herceg.docx
+++ b/dokumentacija/IRUO_Projekt_Juraj_Herceg.docx
@@ -384,7 +384,7 @@
           <w:color w:val="000000"/>
           <w:sz w:val="22"/>
         </w:rPr>
-        <w:t xml:space="preserve">Napomena o opsegu izrade: težište ovog rada je na dizajnu arhitekture i implementaciji infrastrukture kao koda (IaC). Terraform konfiguracije i skripte napisane su tako da ispravno izvršavaju sve tražene funkcije, a njihova se ispravnost i potpunost provjeravaju ugrađenim Terraform alatima za statičku provjeru i izradu plana izvođenja (engl. execution plan) naredbama </w:t>
+        <w:t>Napomena o opsegu izrade: OpenStack dio okoline stvarno je deployan i provjeren na Red Hat Academy okolini (tečaj CL110 — Red Hat OpenStack Platform 16.1). Jednim pokretanjem Terraforma uspješno je kreirana kompletna infrastruktura — izolirane mreže po programeru, jump host s javnim IP-om, DevOps Lead VM, dvije Moodle instance, blok diskovi (OS + data), objektna pohrana (Swift) te cjelovit IAM (Keystone projekti, korisnici, grupe i role) — što potvrđuje ispravnost IaC koda na stvarnom OpenStacku:</w:t>
       </w:r>
     </w:p>
     <w:p>
@@ -408,7 +408,7 @@
           <w:color w:val="000000"/>
           <w:sz w:val="17"/>
         </w:rPr>
-        <w:t>terraform init</w:t>
+        <w:t>source ~/admin-rc</w:t>
       </w:r>
       <w:r>
         <w:br/>
@@ -421,7 +421,7 @@
           <w:color w:val="000000"/>
           <w:sz w:val="17"/>
         </w:rPr>
-        <w:t>terraform validate</w:t>
+        <w:t>terraform init</w:t>
       </w:r>
       <w:r>
         <w:br/>
@@ -434,7 +434,20 @@
           <w:color w:val="000000"/>
           <w:sz w:val="17"/>
         </w:rPr>
-        <w:t>terraform plan -var "users_csv=../../scripts/users.csv"</w:t>
+        <w:t>terraform apply -auto-approve</w:t>
+      </w:r>
+      <w:r>
+        <w:br/>
+      </w:r>
+      <w:r>
+        <w:rPr>
+          <w:rFonts w:ascii="Consolas" w:hAnsi="Consolas" w:eastAsia="Consolas"/>
+          <w:b w:val="0"/>
+          <w:i w:val="0"/>
+          <w:color w:val="000000"/>
+          <w:sz w:val="17"/>
+        </w:rPr>
+        <w:t># Apply complete! Resources: 49 added, 0 changed, 0 destroyed.</w:t>
       </w:r>
     </w:p>
     <w:p>
@@ -450,7 +463,7 @@
           <w:color w:val="000000"/>
           <w:sz w:val="22"/>
         </w:rPr>
-        <w:t>čime se potvrđuje valjanost konfiguracije bez stvarnog stvaranja resursa u oblaku. Sav je kod organiziran u git repozitorij, a struktura projekta opisana je u poglavlju 3.</w:t>
+        <w:t>Zbog ograničenja dijeljene akademske okoline (oko 5 GB slobodnog radnog spremnika na poslužiteljima, CephFS Manila pozadinski sustav i resursno ograničena Octavia) pojedine se stavke u toj okolini prilagođavaju varijablama (manji flavor te opcionalno isključivanje balansera i datotečne pohrane putem zastavica use_tenant_isolation, enable_loadbalancer, enable_file_share i share_proto), dok puna arhitektura (2 vCPU / 4 GB, Octavia load balancer i Manila NFS) ostaje zadana u kodu. Azure dio realiziran je kao infrastruktura kao kod uz dijagram i procjenu troškova. Sav je kod organiziran u git repozitorij, a struktura projekta opisana je u poglavlju 3.</w:t>
       </w:r>
     </w:p>
     <w:p>
@@ -5068,7 +5081,7 @@
           <w:color w:val="000000"/>
           <w:sz w:val="22"/>
         </w:rPr>
-        <w:t>OpenStack okolina realizirana je Terraform providerom terraform-provider-openstack. Provider se autenticira kao cloud-admin jer kreira zasebne projekte i korisnike za svakog programera. Slika 1 prikazuje cjelokupnu arhitekturu.</w:t>
+        <w:t>OpenStack okolina realizirana je Terraform providerom terraform-provider-openstack. Provider se autenticira kao cloud-admin jer kreira zasebne projekte i korisnike za svakog programera. Okolina je deployana i provjerena na Red Hat Academy okolini (CL110, RHOSP 16.1) — svi su resursi uspješno kreirani jednim pokretanjem (terraform apply: 49 resursa, sve instance u stanju ACTIVE, jump host s javnim IP-om). Slika 1 prikazuje cjelokupnu arhitekturu.</w:t>
       </w:r>
     </w:p>
     <w:p>

</xml_diff>

<commit_message>
Dokumentacija: puni testni scenarij (2 programera + voditelj, 6 instanci ACTIVE) + Slika 5 (dokaz deploya na CL110)
Co-Authored-By: Claude Opus 4.8 <noreply@anthropic.com>
</commit_message>
<xml_diff>
--- a/dokumentacija/IRUO_Projekt_Juraj_Herceg.docx
+++ b/dokumentacija/IRUO_Projekt_Juraj_Herceg.docx
@@ -384,7 +384,7 @@
           <w:color w:val="000000"/>
           <w:sz w:val="22"/>
         </w:rPr>
-        <w:t>Napomena o opsegu izrade: OpenStack dio okoline stvarno je deployan i provjeren na Red Hat Academy okolini (tečaj CL110 — Red Hat OpenStack Platform 16.1). Jednim pokretanjem Terraforma uspješno je kreirana kompletna infrastruktura — izolirane mreže po programeru, jump host s javnim IP-om, DevOps Lead VM, dvije Moodle instance, blok diskovi (OS + data), objektna pohrana (Swift) te cjelovit IAM (Keystone projekti, korisnici, grupe i role) — što potvrđuje ispravnost IaC koda na stvarnom OpenStacku:</w:t>
+        <w:t>Napomena o opsegu izrade: OpenStack dio okoline stvarno je deployan i provjeren na Red Hat Academy okolini (tečaj CL110 — Red Hat OpenStack Platform 16.1). Jednim pokretanjem Terraforma iz jedne CSV datoteke uspješno je kreiran kompletan testni scenarij iz zadatka — dva programera (luka.lukic i marko.maric) i voditelj tima: dvije izolirane mreže po programeru, jump host s javnim (floating) IP-om, DevOps Lead VM (oba multi-homed u obje dev mreže), po dvije Moodle instance za svakog programera (ukupno šest virtualnih strojeva u stanju ACTIVE), blok diskovi (OS + data), objektna pohrana (Swift) te cjelovit IAM (Keystone projekti, korisnici, grupe i role) — što potvrđuje ispravnost IaC koda na stvarnom OpenStacku:</w:t>
       </w:r>
     </w:p>
     <w:p>
@@ -447,7 +447,7 @@
           <w:color w:val="000000"/>
           <w:sz w:val="17"/>
         </w:rPr>
-        <w:t># Apply complete! Resources: 49 added, 0 changed, 0 destroyed.</w:t>
+        <w:t># 6 instanci ACTIVE: jump (floating IP), lead, moodle-luka-01/02, moodle-marko-01/02</w:t>
       </w:r>
     </w:p>
     <w:p>
@@ -5081,7 +5081,7 @@
           <w:color w:val="000000"/>
           <w:sz w:val="22"/>
         </w:rPr>
-        <w:t>OpenStack okolina realizirana je Terraform providerom terraform-provider-openstack. Provider se autenticira kao cloud-admin jer kreira zasebne projekte i korisnike za svakog programera. Okolina je deployana i provjerena na Red Hat Academy okolini (CL110, RHOSP 16.1) — svi su resursi uspješno kreirani jednim pokretanjem (terraform apply: 49 resursa, sve instance u stanju ACTIVE, jump host s javnim IP-om). Slika 1 prikazuje cjelokupnu arhitekturu.</w:t>
+        <w:t>OpenStack okolina realizirana je Terraform providerom terraform-provider-openstack. Provider se autenticira kao cloud-admin jer kreira zasebne projekte i korisnike za svakog programera. Okolina je deployana i provjerena na Red Hat Academy okolini (CL110, RHOSP 16.1) — puni testni scenarij (dva programera i voditelj tima) uspješno je kreiran jednim pokretanjem (šest instanci u stanju ACTIVE: jump host s floating IP-om, DevOps Lead VM te po dvije Moodle instance za svakog programera, svaki u svojoj izoliranoj mreži). Slika 1 prikazuje cjelokupnu arhitekturu.</w:t>
       </w:r>
     </w:p>
     <w:p>
@@ -7478,7 +7478,67 @@
           <w:color w:val="000000"/>
           <w:sz w:val="22"/>
         </w:rPr>
-        <w:t>Skripta podržava i parametar za provjeru bez izgradnje (-PlanOnly / -p), koji izvodi terraform plan. Upravo je taj način korišten za verifikaciju ispravnosti konfiguracije u sklopu ovog kolegija, budući da se okolina ne deploya.</w:t>
+        <w:t>Skripta podržava i parametar za provjeru bez izgradnje (-PlanOnly / -p), koji izvodi terraform plan. OpenStack okolina nije samo validirana nego je i stvarno deployana i provjerena na Red Hat Academy okolini (CL110, RHOSP 16.1): puni testni scenarij — dva programera i voditelj tima — izgrađen je jednim pozivom, a rezultat (šest instanci u stanju ACTIVE) prikazan je na Slici 5. Azure dio ostaje na razini IaC koda, dijagrama i procjene troškova do aktivacije pretplate.</w:t>
+      </w:r>
+    </w:p>
+    <w:p>
+      <w:pPr>
+        <w:spacing w:after="40"/>
+      </w:pPr>
+    </w:p>
+    <w:p>
+      <w:pPr>
+        <w:jc w:val="center"/>
+      </w:pPr>
+      <w:r>
+        <w:drawing>
+          <wp:inline xmlns:a="http://schemas.openxmlformats.org/drawingml/2006/main" xmlns:pic="http://schemas.openxmlformats.org/drawingml/2006/picture">
+            <wp:extent cx="5760000" cy="2926186"/>
+            <wp:docPr id="5" name="Picture 5"/>
+            <wp:cNvGraphicFramePr>
+              <a:graphicFrameLocks noChangeAspect="1"/>
+            </wp:cNvGraphicFramePr>
+            <a:graphic>
+              <a:graphicData uri="http://schemas.openxmlformats.org/drawingml/2006/picture">
+                <pic:pic>
+                  <pic:nvPicPr>
+                    <pic:cNvPr id="0" name="05_openstack_deploy_cl110.png"/>
+                    <pic:cNvPicPr/>
+                  </pic:nvPicPr>
+                  <pic:blipFill>
+                    <a:blip r:embed="rId14"/>
+                    <a:stretch>
+                      <a:fillRect/>
+                    </a:stretch>
+                  </pic:blipFill>
+                  <pic:spPr>
+                    <a:xfrm>
+                      <a:off x="0" y="0"/>
+                      <a:ext cx="5760000" cy="2926186"/>
+                    </a:xfrm>
+                    <a:prstGeom prst="rect"/>
+                  </pic:spPr>
+                </pic:pic>
+              </a:graphicData>
+            </a:graphic>
+          </wp:inline>
+        </w:drawing>
+      </w:r>
+    </w:p>
+    <w:p>
+      <w:pPr>
+        <w:spacing w:after="200"/>
+        <w:jc w:val="center"/>
+      </w:pPr>
+      <w:r>
+        <w:rPr>
+          <w:rFonts w:ascii="Times New Roman" w:hAnsi="Times New Roman" w:eastAsia="Times New Roman"/>
+          <w:b w:val="0"/>
+          <w:i/>
+          <w:color w:val="000000"/>
+          <w:sz w:val="20"/>
+        </w:rPr>
+        <w:t>Slika 5. Rezultat deploya na Red Hat Academy (CL110) — terraform output i 'openstack server list': šest instanci u stanju ACTIVE (jump s floating IP-om, lead te po dvije Moodle instance za programere luka.lukic i marko.maric), svaki programer u izoliranoj mreži</w:t>
       </w:r>
     </w:p>
     <w:p>

</xml_diff>

<commit_message>
Dokumentacija: dodaj Sliku 6 (provjera IAM-a i mrežne izolacije na CL110)
Co-Authored-By: Claude Opus 4.8 <noreply@anthropic.com>
</commit_message>
<xml_diff>
--- a/dokumentacija/IRUO_Projekt_Juraj_Herceg.docx
+++ b/dokumentacija/IRUO_Projekt_Juraj_Herceg.docx
@@ -7543,6 +7543,82 @@
     </w:p>
     <w:p>
       <w:pPr>
+        <w:spacing w:after="120"/>
+        <w:jc w:val="both"/>
+      </w:pPr>
+      <w:r>
+        <w:rPr>
+          <w:rFonts w:ascii="Times New Roman" w:hAnsi="Times New Roman" w:eastAsia="Times New Roman"/>
+          <w:b w:val="0"/>
+          <w:i w:val="0"/>
+          <w:color w:val="000000"/>
+          <w:sz w:val="22"/>
+        </w:rPr>
+        <w:t>Dodatna provjera (Slika 6) potvrđuje IAM i mrežnu izolaciju: tri Keystone projekta (hub i dva izolirana tenanta programera), korisnici kreirani iz CSV-a s pripadnim rolama (voditelj ana.anic ima rolu member na svim projektima, programeri samo na svojima), zasebne mreže po programeru, jedini javni (floating) IP dodijeljen je jump hostu te pridruženi (in-use) data diskovi.</w:t>
+      </w:r>
+    </w:p>
+    <w:p>
+      <w:pPr>
+        <w:spacing w:after="40"/>
+      </w:pPr>
+    </w:p>
+    <w:p>
+      <w:pPr>
+        <w:jc w:val="center"/>
+      </w:pPr>
+      <w:r>
+        <w:drawing>
+          <wp:inline xmlns:a="http://schemas.openxmlformats.org/drawingml/2006/main" xmlns:pic="http://schemas.openxmlformats.org/drawingml/2006/picture">
+            <wp:extent cx="5760000" cy="2289485"/>
+            <wp:docPr id="6" name="Picture 6"/>
+            <wp:cNvGraphicFramePr>
+              <a:graphicFrameLocks noChangeAspect="1"/>
+            </wp:cNvGraphicFramePr>
+            <a:graphic>
+              <a:graphicData uri="http://schemas.openxmlformats.org/drawingml/2006/picture">
+                <pic:pic>
+                  <pic:nvPicPr>
+                    <pic:cNvPr id="0" name="06_openstack_iam_isolation.png"/>
+                    <pic:cNvPicPr/>
+                  </pic:nvPicPr>
+                  <pic:blipFill>
+                    <a:blip r:embed="rId15"/>
+                    <a:stretch>
+                      <a:fillRect/>
+                    </a:stretch>
+                  </pic:blipFill>
+                  <pic:spPr>
+                    <a:xfrm>
+                      <a:off x="0" y="0"/>
+                      <a:ext cx="5760000" cy="2289485"/>
+                    </a:xfrm>
+                    <a:prstGeom prst="rect"/>
+                  </pic:spPr>
+                </pic:pic>
+              </a:graphicData>
+            </a:graphic>
+          </wp:inline>
+        </w:drawing>
+      </w:r>
+    </w:p>
+    <w:p>
+      <w:pPr>
+        <w:spacing w:after="200"/>
+        <w:jc w:val="center"/>
+      </w:pPr>
+      <w:r>
+        <w:rPr>
+          <w:rFonts w:ascii="Times New Roman" w:hAnsi="Times New Roman" w:eastAsia="Times New Roman"/>
+          <w:b w:val="0"/>
+          <w:i/>
+          <w:color w:val="000000"/>
+          <w:sz w:val="20"/>
+        </w:rPr>
+        <w:t>Slika 6. Provjera deploya — Keystone projekti/korisnici/role iz CSV-a, izolirane mreže po programeru, jedini floating IP na jump hostu i pridruženi data diskovi</w:t>
+      </w:r>
+    </w:p>
+    <w:p>
+      <w:pPr>
         <w:pStyle w:val="Heading1"/>
       </w:pPr>
       <w:r>

</xml_diff>

<commit_message>
Azure: live deploy na Azure for Students + dokazi (Slike 7-12) i prilagodbe
- enable_aad_users / enable_bastion toggle (student tenant bez AAD admin, brzi/jeftini deploy)
- ispravak imena Managed Identityja (bez tocke)
- dokumentacija 3.9: stvarni Azure deploy (centralindia), infra deployana, VM-ovi blokirani
  platformskim ogranicenjem (region policy + kvota + B-series kapacitet)
- 6 Portal screenshotova kao dokaz (RG+tagovi, VNet diagram, NSG, LB, Managed Identity, RBAC rola)

Co-Authored-By: Claude Opus 4.8 <noreply@anthropic.com>
</commit_message>
<xml_diff>
--- a/dokumentacija/IRUO_Projekt_Juraj_Herceg.docx
+++ b/dokumentacija/IRUO_Projekt_Juraj_Herceg.docx
@@ -7615,6 +7615,390 @@
           <w:sz w:val="20"/>
         </w:rPr>
         <w:t>Slika 6. Provjera deploya — Keystone projekti/korisnici/role iz CSV-a, izolirane mreže po programeru, jedini floating IP na jump hostu i pridruženi data diskovi</w:t>
+      </w:r>
+    </w:p>
+    <w:p>
+      <w:pPr>
+        <w:pStyle w:val="Heading2"/>
+      </w:pPr>
+      <w:r>
+        <w:t>3.9. Stvarni deployment i provjera na Azureu (Azure for Students)</w:t>
+      </w:r>
+    </w:p>
+    <w:p>
+      <w:pPr>
+        <w:spacing w:after="120"/>
+        <w:jc w:val="both"/>
+      </w:pPr>
+      <w:r>
+        <w:rPr>
+          <w:rFonts w:ascii="Times New Roman" w:hAnsi="Times New Roman" w:eastAsia="Times New Roman"/>
+          <w:b w:val="0"/>
+          <w:i w:val="0"/>
+          <w:color w:val="000000"/>
+          <w:sz w:val="22"/>
+        </w:rPr>
+        <w:t>Azure dio okoline također je deployan na stvarnoj pretplati (Azure for Students). Cjelokupna konfiguracija prethodno je validirana (terraform plan: 88 resursa, 0 grešaka), a zatim primijenjena. Pritom su otkrivena dva platformska ograničenja studentske pretplate: (1) dozvoljene su samo određene regije (policy „Allowed resource deployment regions”), pa je westeurope zamijenjen regijom centralindia; (2) kvota je vrlo niska (6 ukupnih / 4 vCPU-a B-serije), uz trenutnu nedostupnost kapaciteta B-serije u svim dozvoljenim regijama. Zbog toga virtualni strojevi nisu mogli biti stvoreni (SkuNotAvailable — kapacitet), dok je sva ostala infrastruktura uspješno deployana i provjerena: resource grupe, virtualne mreže s peeringom, NSG i ASG, load balancer s pravilima i health-probeom, NAT gateway, managed diskovi, Managed Identity te custom RBAC rola. Prilagodbe studentskoj okolini izvedene su varijablama (location, vm_size te zastavice enable_aad_users i enable_bastion), dok puni dizajn (2 vCPU/4 GB, kreiranje Entra ID korisnika iz CSV-a, Azure Bastion) ostaje zadan u kodu. Slike 7–12 prikazuju provjeru deployanih Azure resursa u Azure Portalu.</w:t>
+      </w:r>
+    </w:p>
+    <w:p>
+      <w:pPr>
+        <w:spacing w:after="40"/>
+      </w:pPr>
+    </w:p>
+    <w:p>
+      <w:pPr>
+        <w:jc w:val="center"/>
+      </w:pPr>
+      <w:r>
+        <w:drawing>
+          <wp:inline xmlns:a="http://schemas.openxmlformats.org/drawingml/2006/main" xmlns:pic="http://schemas.openxmlformats.org/drawingml/2006/picture">
+            <wp:extent cx="5760000" cy="2932527"/>
+            <wp:docPr id="7" name="Picture 7"/>
+            <wp:cNvGraphicFramePr>
+              <a:graphicFrameLocks noChangeAspect="1"/>
+            </wp:cNvGraphicFramePr>
+            <a:graphic>
+              <a:graphicData uri="http://schemas.openxmlformats.org/drawingml/2006/picture">
+                <pic:pic>
+                  <pic:nvPicPr>
+                    <pic:cNvPr id="0" name="az_01_rg_resources_tags.png"/>
+                    <pic:cNvPicPr/>
+                  </pic:nvPicPr>
+                  <pic:blipFill>
+                    <a:blip r:embed="rId16"/>
+                    <a:stretch>
+                      <a:fillRect/>
+                    </a:stretch>
+                  </pic:blipFill>
+                  <pic:spPr>
+                    <a:xfrm>
+                      <a:off x="0" y="0"/>
+                      <a:ext cx="5760000" cy="2932527"/>
+                    </a:xfrm>
+                    <a:prstGeom prst="rect"/>
+                  </pic:spPr>
+                </pic:pic>
+              </a:graphicData>
+            </a:graphic>
+          </wp:inline>
+        </w:drawing>
+      </w:r>
+    </w:p>
+    <w:p>
+      <w:pPr>
+        <w:spacing w:after="200"/>
+        <w:jc w:val="center"/>
+      </w:pPr>
+      <w:r>
+        <w:rPr>
+          <w:rFonts w:ascii="Times New Roman" w:hAnsi="Times New Roman" w:eastAsia="Times New Roman"/>
+          <w:b w:val="0"/>
+          <w:i/>
+          <w:color w:val="000000"/>
+          <w:sz w:val="20"/>
+        </w:rPr>
+        <w:t>Slika 7. Azure: resource grupa programera s obveznim tagovima (project: techsprint, environment: testing, owner) i deployanim resursima (VNet, NSG, ASG, LB, NAT, Managed Identity, diskovi)</w:t>
+      </w:r>
+    </w:p>
+    <w:p>
+      <w:pPr>
+        <w:spacing w:after="40"/>
+      </w:pPr>
+    </w:p>
+    <w:p>
+      <w:pPr>
+        <w:jc w:val="center"/>
+      </w:pPr>
+      <w:r>
+        <w:drawing>
+          <wp:inline xmlns:a="http://schemas.openxmlformats.org/drawingml/2006/main" xmlns:pic="http://schemas.openxmlformats.org/drawingml/2006/picture">
+            <wp:extent cx="5760000" cy="2932527"/>
+            <wp:docPr id="8" name="Picture 8"/>
+            <wp:cNvGraphicFramePr>
+              <a:graphicFrameLocks noChangeAspect="1"/>
+            </wp:cNvGraphicFramePr>
+            <a:graphic>
+              <a:graphicData uri="http://schemas.openxmlformats.org/drawingml/2006/picture">
+                <pic:pic>
+                  <pic:nvPicPr>
+                    <pic:cNvPr id="0" name="az_02_vnet_diagram.png"/>
+                    <pic:cNvPicPr/>
+                  </pic:nvPicPr>
+                  <pic:blipFill>
+                    <a:blip r:embed="rId17"/>
+                    <a:stretch>
+                      <a:fillRect/>
+                    </a:stretch>
+                  </pic:blipFill>
+                  <pic:spPr>
+                    <a:xfrm>
+                      <a:off x="0" y="0"/>
+                      <a:ext cx="5760000" cy="2932527"/>
+                    </a:xfrm>
+                    <a:prstGeom prst="rect"/>
+                  </pic:spPr>
+                </pic:pic>
+              </a:graphicData>
+            </a:graphic>
+          </wp:inline>
+        </w:drawing>
+      </w:r>
+    </w:p>
+    <w:p>
+      <w:pPr>
+        <w:spacing w:after="200"/>
+        <w:jc w:val="center"/>
+      </w:pPr>
+      <w:r>
+        <w:rPr>
+          <w:rFonts w:ascii="Times New Roman" w:hAnsi="Times New Roman" w:eastAsia="Times New Roman"/>
+          <w:b w:val="0"/>
+          <w:i/>
+          <w:color w:val="000000"/>
+          <w:sz w:val="20"/>
+        </w:rPr>
+        <w:t>Slika 8. Azure: dijagram VNeta programera povezanog s hub VNetom (peering), NSG-om i NAT gatewayem — mrežna izolacija</w:t>
+      </w:r>
+    </w:p>
+    <w:p>
+      <w:pPr>
+        <w:spacing w:after="40"/>
+      </w:pPr>
+    </w:p>
+    <w:p>
+      <w:pPr>
+        <w:jc w:val="center"/>
+      </w:pPr>
+      <w:r>
+        <w:drawing>
+          <wp:inline xmlns:a="http://schemas.openxmlformats.org/drawingml/2006/main" xmlns:pic="http://schemas.openxmlformats.org/drawingml/2006/picture">
+            <wp:extent cx="5760000" cy="2932527"/>
+            <wp:docPr id="9" name="Picture 9"/>
+            <wp:cNvGraphicFramePr>
+              <a:graphicFrameLocks noChangeAspect="1"/>
+            </wp:cNvGraphicFramePr>
+            <a:graphic>
+              <a:graphicData uri="http://schemas.openxmlformats.org/drawingml/2006/picture">
+                <pic:pic>
+                  <pic:nvPicPr>
+                    <pic:cNvPr id="0" name="az_03_nsg_rules.png"/>
+                    <pic:cNvPicPr/>
+                  </pic:nvPicPr>
+                  <pic:blipFill>
+                    <a:blip r:embed="rId18"/>
+                    <a:stretch>
+                      <a:fillRect/>
+                    </a:stretch>
+                  </pic:blipFill>
+                  <pic:spPr>
+                    <a:xfrm>
+                      <a:off x="0" y="0"/>
+                      <a:ext cx="5760000" cy="2932527"/>
+                    </a:xfrm>
+                    <a:prstGeom prst="rect"/>
+                  </pic:spPr>
+                </pic:pic>
+              </a:graphicData>
+            </a:graphic>
+          </wp:inline>
+        </w:drawing>
+      </w:r>
+    </w:p>
+    <w:p>
+      <w:pPr>
+        <w:spacing w:after="200"/>
+        <w:jc w:val="center"/>
+      </w:pPr>
+      <w:r>
+        <w:rPr>
+          <w:rFonts w:ascii="Times New Roman" w:hAnsi="Times New Roman" w:eastAsia="Times New Roman"/>
+          <w:b w:val="0"/>
+          <w:i/>
+          <w:color w:val="000000"/>
+          <w:sz w:val="20"/>
+        </w:rPr>
+        <w:t>Slika 9. Azure: NSG inbound pravila — SSH samo iz hub mreže, web s load balancera, eksplicitni deny Interneta (least-privilege, odredište je ASG Moodle instanci)</w:t>
+      </w:r>
+    </w:p>
+    <w:p>
+      <w:pPr>
+        <w:spacing w:after="40"/>
+      </w:pPr>
+    </w:p>
+    <w:p>
+      <w:pPr>
+        <w:jc w:val="center"/>
+      </w:pPr>
+      <w:r>
+        <w:drawing>
+          <wp:inline xmlns:a="http://schemas.openxmlformats.org/drawingml/2006/main" xmlns:pic="http://schemas.openxmlformats.org/drawingml/2006/picture">
+            <wp:extent cx="5760000" cy="2932527"/>
+            <wp:docPr id="10" name="Picture 10"/>
+            <wp:cNvGraphicFramePr>
+              <a:graphicFrameLocks noChangeAspect="1"/>
+            </wp:cNvGraphicFramePr>
+            <a:graphic>
+              <a:graphicData uri="http://schemas.openxmlformats.org/drawingml/2006/picture">
+                <pic:pic>
+                  <pic:nvPicPr>
+                    <pic:cNvPr id="0" name="az_04_lb_rules.png"/>
+                    <pic:cNvPicPr/>
+                  </pic:nvPicPr>
+                  <pic:blipFill>
+                    <a:blip r:embed="rId19"/>
+                    <a:stretch>
+                      <a:fillRect/>
+                    </a:stretch>
+                  </pic:blipFill>
+                  <pic:spPr>
+                    <a:xfrm>
+                      <a:off x="0" y="0"/>
+                      <a:ext cx="5760000" cy="2932527"/>
+                    </a:xfrm>
+                    <a:prstGeom prst="rect"/>
+                  </pic:spPr>
+                </pic:pic>
+              </a:graphicData>
+            </a:graphic>
+          </wp:inline>
+        </w:drawing>
+      </w:r>
+    </w:p>
+    <w:p>
+      <w:pPr>
+        <w:spacing w:after="200"/>
+        <w:jc w:val="center"/>
+      </w:pPr>
+      <w:r>
+        <w:rPr>
+          <w:rFonts w:ascii="Times New Roman" w:hAnsi="Times New Roman" w:eastAsia="Times New Roman"/>
+          <w:b w:val="0"/>
+          <w:i/>
+          <w:color w:val="000000"/>
+          <w:sz w:val="20"/>
+        </w:rPr>
+        <w:t>Slika 10. Azure: pravila load balancera (HTTP/HTTPS) prema backend poolu Moodle cvorova uz health-probe</w:t>
+      </w:r>
+    </w:p>
+    <w:p>
+      <w:pPr>
+        <w:spacing w:after="40"/>
+      </w:pPr>
+    </w:p>
+    <w:p>
+      <w:pPr>
+        <w:jc w:val="center"/>
+      </w:pPr>
+      <w:r>
+        <w:drawing>
+          <wp:inline xmlns:a="http://schemas.openxmlformats.org/drawingml/2006/main" xmlns:pic="http://schemas.openxmlformats.org/drawingml/2006/picture">
+            <wp:extent cx="5760000" cy="2934056"/>
+            <wp:docPr id="11" name="Picture 11"/>
+            <wp:cNvGraphicFramePr>
+              <a:graphicFrameLocks noChangeAspect="1"/>
+            </wp:cNvGraphicFramePr>
+            <a:graphic>
+              <a:graphicData uri="http://schemas.openxmlformats.org/drawingml/2006/picture">
+                <pic:pic>
+                  <pic:nvPicPr>
+                    <pic:cNvPr id="0" name="az_05_managed_identity.png"/>
+                    <pic:cNvPicPr/>
+                  </pic:nvPicPr>
+                  <pic:blipFill>
+                    <a:blip r:embed="rId20"/>
+                    <a:stretch>
+                      <a:fillRect/>
+                    </a:stretch>
+                  </pic:blipFill>
+                  <pic:spPr>
+                    <a:xfrm>
+                      <a:off x="0" y="0"/>
+                      <a:ext cx="5760000" cy="2934056"/>
+                    </a:xfrm>
+                    <a:prstGeom prst="rect"/>
+                  </pic:spPr>
+                </pic:pic>
+              </a:graphicData>
+            </a:graphic>
+          </wp:inline>
+        </w:drawing>
+      </w:r>
+    </w:p>
+    <w:p>
+      <w:pPr>
+        <w:spacing w:after="200"/>
+        <w:jc w:val="center"/>
+      </w:pPr>
+      <w:r>
+        <w:rPr>
+          <w:rFonts w:ascii="Times New Roman" w:hAnsi="Times New Roman" w:eastAsia="Times New Roman"/>
+          <w:b w:val="0"/>
+          <w:i/>
+          <w:color w:val="000000"/>
+          <w:sz w:val="20"/>
+        </w:rPr>
+        <w:t>Slika 11. Azure: korisnički dodijeljen Managed Identity za pristup objektnoj pohrani (least-privilege)</w:t>
+      </w:r>
+    </w:p>
+    <w:p>
+      <w:pPr>
+        <w:spacing w:after="40"/>
+      </w:pPr>
+    </w:p>
+    <w:p>
+      <w:pPr>
+        <w:jc w:val="center"/>
+      </w:pPr>
+      <w:r>
+        <w:drawing>
+          <wp:inline xmlns:a="http://schemas.openxmlformats.org/drawingml/2006/main" xmlns:pic="http://schemas.openxmlformats.org/drawingml/2006/picture">
+            <wp:extent cx="5760000" cy="2932527"/>
+            <wp:docPr id="12" name="Picture 12"/>
+            <wp:cNvGraphicFramePr>
+              <a:graphicFrameLocks noChangeAspect="1"/>
+            </wp:cNvGraphicFramePr>
+            <a:graphic>
+              <a:graphicData uri="http://schemas.openxmlformats.org/drawingml/2006/picture">
+                <pic:pic>
+                  <pic:nvPicPr>
+                    <pic:cNvPr id="0" name="az_06_custom_rbac_role.png"/>
+                    <pic:cNvPicPr/>
+                  </pic:nvPicPr>
+                  <pic:blipFill>
+                    <a:blip r:embed="rId21"/>
+                    <a:stretch>
+                      <a:fillRect/>
+                    </a:stretch>
+                  </pic:blipFill>
+                  <pic:spPr>
+                    <a:xfrm>
+                      <a:off x="0" y="0"/>
+                      <a:ext cx="5760000" cy="2932527"/>
+                    </a:xfrm>
+                    <a:prstGeom prst="rect"/>
+                  </pic:spPr>
+                </pic:pic>
+              </a:graphicData>
+            </a:graphic>
+          </wp:inline>
+        </w:drawing>
+      </w:r>
+    </w:p>
+    <w:p>
+      <w:pPr>
+        <w:spacing w:after="200"/>
+        <w:jc w:val="center"/>
+      </w:pPr>
+      <w:r>
+        <w:rPr>
+          <w:rFonts w:ascii="Times New Roman" w:hAnsi="Times New Roman" w:eastAsia="Times New Roman"/>
+          <w:b w:val="0"/>
+          <w:i/>
+          <w:color w:val="000000"/>
+          <w:sz w:val="20"/>
+        </w:rPr>
+        <w:t>Slika 12. Azure: custom RBAC rola „TechSprint VM Operator” — dopušta samo start/restart/deallocate i čitanje VM-ova (bez izmjene ili brisanja)</w:t>
       </w:r>
     </w:p>
     <w:p>

</xml_diff>